<commit_message>
added some stuff to the bryce meeting agenda
</commit_message>
<xml_diff>
--- a/Meeting_Minutes/Advisor meetings/Meeting Agendas/Advisor Dr Bryce Meeting Agenda Week 7 Friday.docx
+++ b/Meeting_Minutes/Advisor meetings/Meeting Agendas/Advisor Dr Bryce Meeting Agenda Week 7 Friday.docx
@@ -455,14 +455,12 @@
               </w:rPr>
               <w:t xml:space="preserve">Have Dr. Bryce look over the state of our </w:t>
             </w:r>
-            <w:proofErr w:type="gramStart"/>
-            <w:r>
-              <w:rPr>
-                <w:b/>
-              </w:rPr>
-              <w:t>Proposal</w:t>
-            </w:r>
-            <w:proofErr w:type="gramEnd"/>
+            <w:r>
+              <w:rPr>
+                <w:b/>
+              </w:rPr>
+              <w:t>proposal</w:t>
+            </w:r>
             <w:r>
               <w:rPr>
                 <w:b/>
@@ -582,7 +580,11 @@
               <w:right w:val="single" w:sz="4" w:space="0" w:color="000000"/>
             </w:tcBorders>
           </w:tcPr>
-          <w:p/>
+          <w:p>
+            <w:r>
+              <w:t xml:space="preserve">Introductions </w:t>
+            </w:r>
+          </w:p>
         </w:tc>
         <w:tc>
           <w:tcPr>
@@ -594,7 +596,11 @@
               <w:right w:val="single" w:sz="4" w:space="0" w:color="000000"/>
             </w:tcBorders>
           </w:tcPr>
-          <w:p/>
+          <w:p>
+            <w:r>
+              <w:t>N/a</w:t>
+            </w:r>
+          </w:p>
         </w:tc>
         <w:tc>
           <w:tcPr>
@@ -606,7 +612,11 @@
               <w:right w:val="single" w:sz="4" w:space="0" w:color="000000"/>
             </w:tcBorders>
           </w:tcPr>
-          <w:p/>
+          <w:p>
+            <w:r>
+              <w:t>5m</w:t>
+            </w:r>
+          </w:p>
         </w:tc>
       </w:tr>
       <w:tr>
@@ -623,7 +633,14 @@
               <w:right w:val="single" w:sz="4" w:space="0" w:color="000000"/>
             </w:tcBorders>
           </w:tcPr>
-          <w:p/>
+          <w:p>
+            <w:r>
+              <w:t xml:space="preserve">Have Bryce look over </w:t>
+            </w:r>
+            <w:r>
+              <w:t>updated proposal</w:t>
+            </w:r>
+          </w:p>
         </w:tc>
         <w:tc>
           <w:tcPr>
@@ -635,7 +652,11 @@
               <w:right w:val="single" w:sz="4" w:space="0" w:color="000000"/>
             </w:tcBorders>
           </w:tcPr>
-          <w:p/>
+          <w:p>
+            <w:r>
+              <w:t>MB</w:t>
+            </w:r>
+          </w:p>
         </w:tc>
         <w:tc>
           <w:tcPr>
@@ -647,7 +668,11 @@
               <w:right w:val="single" w:sz="4" w:space="0" w:color="000000"/>
             </w:tcBorders>
           </w:tcPr>
-          <w:p/>
+          <w:p>
+            <w:r>
+              <w:t>10m</w:t>
+            </w:r>
+          </w:p>
         </w:tc>
       </w:tr>
       <w:tr>
@@ -664,7 +689,11 @@
               <w:right w:val="single" w:sz="4" w:space="0" w:color="000000"/>
             </w:tcBorders>
           </w:tcPr>
-          <w:p/>
+          <w:p>
+            <w:r>
+              <w:t>Discuss proposal</w:t>
+            </w:r>
+          </w:p>
         </w:tc>
         <w:tc>
           <w:tcPr>
@@ -676,7 +705,11 @@
               <w:right w:val="single" w:sz="4" w:space="0" w:color="000000"/>
             </w:tcBorders>
           </w:tcPr>
-          <w:p/>
+          <w:p>
+            <w:r>
+              <w:t>MB</w:t>
+            </w:r>
+          </w:p>
         </w:tc>
         <w:tc>
           <w:tcPr>
@@ -688,7 +721,11 @@
               <w:right w:val="single" w:sz="4" w:space="0" w:color="000000"/>
             </w:tcBorders>
           </w:tcPr>
-          <w:p/>
+          <w:p>
+            <w:r>
+              <w:t>10m</w:t>
+            </w:r>
+          </w:p>
         </w:tc>
       </w:tr>
       <w:tr>
@@ -705,7 +742,11 @@
               <w:right w:val="single" w:sz="4" w:space="0" w:color="000000"/>
             </w:tcBorders>
           </w:tcPr>
-          <w:p/>
+          <w:p>
+            <w:r>
+              <w:t xml:space="preserve">Discuss proposal changes </w:t>
+            </w:r>
+          </w:p>
         </w:tc>
         <w:tc>
           <w:tcPr>
@@ -717,7 +758,11 @@
               <w:right w:val="single" w:sz="4" w:space="0" w:color="000000"/>
             </w:tcBorders>
           </w:tcPr>
-          <w:p/>
+          <w:p>
+            <w:r>
+              <w:t>MB</w:t>
+            </w:r>
+          </w:p>
         </w:tc>
         <w:tc>
           <w:tcPr>
@@ -729,7 +774,11 @@
               <w:right w:val="single" w:sz="4" w:space="0" w:color="000000"/>
             </w:tcBorders>
           </w:tcPr>
-          <w:p/>
+          <w:p>
+            <w:r>
+              <w:t>10m</w:t>
+            </w:r>
+          </w:p>
         </w:tc>
       </w:tr>
       <w:tr>
@@ -748,7 +797,7 @@
           </w:tcPr>
           <w:p>
             <w:r>
-              <w:br/>
+              <w:t>Additional questions</w:t>
             </w:r>
           </w:p>
         </w:tc>
@@ -762,7 +811,11 @@
               <w:right w:val="single" w:sz="4" w:space="0" w:color="000000"/>
             </w:tcBorders>
           </w:tcPr>
-          <w:p/>
+          <w:p>
+            <w:r>
+              <w:t>N/A</w:t>
+            </w:r>
+          </w:p>
         </w:tc>
         <w:tc>
           <w:tcPr>
@@ -774,7 +827,11 @@
               <w:right w:val="single" w:sz="4" w:space="0" w:color="000000"/>
             </w:tcBorders>
           </w:tcPr>
-          <w:p/>
+          <w:p>
+            <w:r>
+              <w:t>N/A</w:t>
+            </w:r>
+          </w:p>
         </w:tc>
       </w:tr>
       <w:tr>
@@ -971,7 +1028,6 @@
         <w:docPartUnique/>
       </w:docPartObj>
     </w:sdtPr>
-    <w:sdtEndPr/>
     <w:sdtContent>
       <w:sdt>
         <w:sdtPr>
@@ -981,7 +1037,6 @@
             <w:docPartUnique/>
           </w:docPartObj>
         </w:sdtPr>
-        <w:sdtEndPr/>
         <w:sdtContent>
           <w:p>
             <w:pPr>

</xml_diff>

<commit_message>
Adding weekly log and research log wk7
</commit_message>
<xml_diff>
--- a/Meeting_Minutes/Advisor meetings/Meeting Agendas/Advisor Dr Bryce Meeting Agenda Week 7 Friday.docx
+++ b/Meeting_Minutes/Advisor meetings/Meeting Agendas/Advisor Dr Bryce Meeting Agenda Week 7 Friday.docx
@@ -598,7 +598,10 @@
           </w:tcPr>
           <w:p>
             <w:r>
-              <w:t>N/a</w:t>
+              <w:t>N/</w:t>
+            </w:r>
+            <w:r>
+              <w:t>A</w:t>
             </w:r>
           </w:p>
         </w:tc>

</xml_diff>